<commit_message>
Fixed typo in Arlene's Oatmeal Raisin Cookies.
</commit_message>
<xml_diff>
--- a/recipes/Arlenes_Oatmeal_Raisin_Cookies.docx
+++ b/recipes/Arlenes_Oatmeal_Raisin_Cookies.docx
@@ -833,128 +833,189 @@
         </w:numPr>
         <w:rPr>
           <w:rFonts w:ascii="Arial" w:hAnsi="Arial"/>
-          <w:b/>
-          <w:sz w:val="32"/>
-        </w:rPr>
-      </w:pPr>
-      <w:r>
-        <w:rPr>
-          <w:rFonts w:ascii="Arial" w:hAnsi="Arial"/>
-          <w:b/>
-          <w:sz w:val="32"/>
+          <w:b w:val="1"/>
+          <w:bCs w:val="1"/>
+          <w:sz w:val="32"/>
+          <w:szCs w:val="32"/>
+        </w:rPr>
+      </w:pPr>
+      <w:r>
+        <w:rPr>
+          <w:rFonts w:ascii="Arial" w:hAnsi="Arial"/>
+          <w:b w:val="1"/>
+          <w:bCs w:val="1"/>
+          <w:sz w:val="32"/>
+          <w:szCs w:val="32"/>
         </w:rPr>
         <w:t xml:space="preserve">Use a </w:t>
       </w:r>
       <w:r>
         <w:rPr>
           <w:rFonts w:ascii="Arial" w:hAnsi="Arial"/>
-          <w:b/>
-          <w:sz w:val="32"/>
+          <w:b w:val="1"/>
+          <w:bCs w:val="1"/>
+          <w:sz w:val="32"/>
+          <w:szCs w:val="32"/>
         </w:rPr>
         <w:t>stainless-steel</w:t>
       </w:r>
       <w:r>
         <w:rPr>
           <w:rFonts w:ascii="Arial" w:hAnsi="Arial"/>
-          <w:b/>
-          <w:sz w:val="32"/>
+          <w:b w:val="1"/>
+          <w:bCs w:val="1"/>
+          <w:sz w:val="32"/>
+          <w:szCs w:val="32"/>
         </w:rPr>
         <w:t xml:space="preserve"> ice cream scoop a</w:t>
       </w:r>
       <w:r>
         <w:rPr>
           <w:rFonts w:ascii="Arial" w:hAnsi="Arial"/>
-          <w:b/>
-          <w:sz w:val="32"/>
+          <w:b w:val="1"/>
+          <w:bCs w:val="1"/>
+          <w:sz w:val="32"/>
+          <w:szCs w:val="32"/>
         </w:rPr>
         <w:t xml:space="preserve">lso known as a </w:t>
       </w:r>
       <w:r>
         <w:rPr>
           <w:rFonts w:ascii="Arial" w:hAnsi="Arial"/>
-          <w:b/>
-          <w:sz w:val="32"/>
-        </w:rPr>
-        <w:t>portion scoop</w:t>
-      </w:r>
-      <w:r>
-        <w:rPr>
-          <w:rFonts w:ascii="Arial" w:hAnsi="Arial"/>
-          <w:b/>
-          <w:sz w:val="32"/>
+          <w:b w:val="1"/>
+          <w:bCs w:val="1"/>
+          <w:sz w:val="32"/>
+          <w:szCs w:val="32"/>
+        </w:rPr>
+        <w:t>portion</w:t>
+      </w:r>
+      <w:r>
+        <w:rPr>
+          <w:rFonts w:ascii="Arial" w:hAnsi="Arial"/>
+          <w:b w:val="1"/>
+          <w:bCs w:val="1"/>
+          <w:sz w:val="32"/>
+          <w:szCs w:val="32"/>
+        </w:rPr>
+        <w:t xml:space="preserve"> scoop</w:t>
+      </w:r>
+      <w:r>
+        <w:rPr>
+          <w:rFonts w:ascii="Arial" w:hAnsi="Arial"/>
+          <w:b w:val="1"/>
+          <w:bCs w:val="1"/>
+          <w:sz w:val="32"/>
+          <w:szCs w:val="32"/>
         </w:rPr>
         <w:t xml:space="preserve"> to </w:t>
       </w:r>
       <w:r>
         <w:rPr>
           <w:rFonts w:ascii="Arial" w:hAnsi="Arial"/>
-          <w:b/>
-          <w:sz w:val="32"/>
-        </w:rPr>
-        <w:t xml:space="preserve">scoop out approximately 2 tbs. of </w:t>
-      </w:r>
-      <w:r>
-        <w:rPr>
-          <w:rFonts w:ascii="Arial" w:hAnsi="Arial"/>
-          <w:b/>
-          <w:sz w:val="32"/>
-        </w:rPr>
-        <w:lastRenderedPageBreak/>
+          <w:b w:val="1"/>
+          <w:bCs w:val="1"/>
+          <w:sz w:val="32"/>
+          <w:szCs w:val="32"/>
+        </w:rPr>
+        <w:t>scoop out approximately 2 tbs</w:t>
+      </w:r>
+      <w:r>
+        <w:rPr>
+          <w:rFonts w:ascii="Arial" w:hAnsi="Arial"/>
+          <w:b w:val="1"/>
+          <w:bCs w:val="1"/>
+          <w:sz w:val="32"/>
+          <w:szCs w:val="32"/>
+        </w:rPr>
+        <w:t>p</w:t>
+      </w:r>
+      <w:r>
+        <w:rPr>
+          <w:rFonts w:ascii="Arial" w:hAnsi="Arial"/>
+          <w:b w:val="1"/>
+          <w:bCs w:val="1"/>
+          <w:sz w:val="32"/>
+          <w:szCs w:val="32"/>
+        </w:rPr>
+        <w:t xml:space="preserve">. of </w:t>
+      </w:r>
+      <w:r>
+        <w:rPr>
+          <w:rFonts w:ascii="Arial" w:hAnsi="Arial"/>
+          <w:b w:val="1"/>
+          <w:bCs w:val="1"/>
+          <w:sz w:val="32"/>
+          <w:szCs w:val="32"/>
+        </w:rPr>
         <w:t xml:space="preserve">dough and release it into the palm of your hand. </w:t>
       </w:r>
       <w:r>
         <w:rPr>
           <w:rFonts w:ascii="Arial" w:hAnsi="Arial"/>
-          <w:b/>
-          <w:sz w:val="32"/>
+          <w:b w:val="1"/>
+          <w:bCs w:val="1"/>
+          <w:sz w:val="32"/>
+          <w:szCs w:val="32"/>
         </w:rPr>
         <w:t xml:space="preserve">Roll </w:t>
       </w:r>
       <w:r>
         <w:rPr>
           <w:rFonts w:ascii="Arial" w:hAnsi="Arial"/>
-          <w:b/>
-          <w:sz w:val="32"/>
+          <w:b w:val="1"/>
+          <w:bCs w:val="1"/>
+          <w:sz w:val="32"/>
+          <w:szCs w:val="32"/>
         </w:rPr>
         <w:t xml:space="preserve">the </w:t>
       </w:r>
       <w:r>
         <w:rPr>
           <w:rFonts w:ascii="Arial" w:hAnsi="Arial"/>
-          <w:b/>
-          <w:sz w:val="32"/>
+          <w:b w:val="1"/>
+          <w:bCs w:val="1"/>
+          <w:sz w:val="32"/>
+          <w:szCs w:val="32"/>
         </w:rPr>
         <w:t xml:space="preserve">dough into round balls and place them on </w:t>
       </w:r>
       <w:r>
         <w:rPr>
           <w:rFonts w:ascii="Arial" w:hAnsi="Arial"/>
-          <w:b/>
-          <w:sz w:val="32"/>
+          <w:b w:val="1"/>
+          <w:bCs w:val="1"/>
+          <w:sz w:val="32"/>
+          <w:szCs w:val="32"/>
         </w:rPr>
         <w:t>p</w:t>
       </w:r>
       <w:r>
         <w:rPr>
           <w:rFonts w:ascii="Arial" w:hAnsi="Arial"/>
-          <w:b/>
-          <w:sz w:val="32"/>
+          <w:b w:val="1"/>
+          <w:bCs w:val="1"/>
+          <w:sz w:val="32"/>
+          <w:szCs w:val="32"/>
         </w:rPr>
         <w:t xml:space="preserve">archment </w:t>
       </w:r>
       <w:r>
         <w:rPr>
           <w:rFonts w:ascii="Arial" w:hAnsi="Arial"/>
-          <w:b/>
-          <w:sz w:val="32"/>
+          <w:b w:val="1"/>
+          <w:bCs w:val="1"/>
+          <w:sz w:val="32"/>
+          <w:szCs w:val="32"/>
         </w:rPr>
         <w:t xml:space="preserve">paper in </w:t>
       </w:r>
       <w:r>
         <w:rPr>
           <w:rFonts w:ascii="Arial" w:hAnsi="Arial"/>
-          <w:b/>
-          <w:sz w:val="32"/>
+          <w:b w:val="1"/>
+          <w:bCs w:val="1"/>
+          <w:sz w:val="32"/>
+          <w:szCs w:val="32"/>
           <w:u w:val="thick"/>
         </w:rPr>
         <w:t>airtight containers</w:t>
@@ -962,8 +1023,10 @@
       <w:r>
         <w:rPr>
           <w:rFonts w:ascii="Arial" w:hAnsi="Arial"/>
-          <w:b/>
-          <w:sz w:val="32"/>
+          <w:b w:val="1"/>
+          <w:bCs w:val="1"/>
+          <w:sz w:val="32"/>
+          <w:szCs w:val="32"/>
         </w:rPr>
         <w:t xml:space="preserve">. </w:t>
       </w:r>
@@ -1256,7 +1319,7 @@
       </w:pPr>
     </w:p>
     <w:sectPr>
-      <w:pgSz w:w="12240" w:h="15840"/>
+      <w:pgSz w:w="12240" w:h="15840" w:orient="portrait"/>
       <w:pgMar w:top="1440" w:right="1440" w:bottom="1440" w:left="1440" w:header="720" w:footer="720" w:gutter="0"/>
       <w:cols w:space="720"/>
       <w:docGrid w:linePitch="360"/>
@@ -1280,7 +1343,7 @@
         <w:ind w:left="720" w:hanging="360"/>
       </w:pPr>
       <w:rPr>
-        <w:rFonts w:ascii="Symbol" w:hAnsi="Symbol" w:hint="default"/>
+        <w:rFonts w:hint="default" w:ascii="Symbol" w:hAnsi="Symbol"/>
       </w:rPr>
     </w:lvl>
     <w:lvl w:ilvl="1" w:tplc="04090003" w:tentative="1">
@@ -1292,7 +1355,7 @@
         <w:ind w:left="1440" w:hanging="360"/>
       </w:pPr>
       <w:rPr>
-        <w:rFonts w:ascii="Courier New" w:hAnsi="Courier New" w:cs="Courier New" w:hint="default"/>
+        <w:rFonts w:hint="default" w:ascii="Courier New" w:hAnsi="Courier New" w:cs="Courier New"/>
       </w:rPr>
     </w:lvl>
     <w:lvl w:ilvl="2" w:tplc="04090005" w:tentative="1">
@@ -1304,7 +1367,7 @@
         <w:ind w:left="2160" w:hanging="360"/>
       </w:pPr>
       <w:rPr>
-        <w:rFonts w:ascii="Wingdings" w:hAnsi="Wingdings" w:hint="default"/>
+        <w:rFonts w:hint="default" w:ascii="Wingdings" w:hAnsi="Wingdings"/>
       </w:rPr>
     </w:lvl>
     <w:lvl w:ilvl="3" w:tplc="04090001" w:tentative="1">
@@ -1316,7 +1379,7 @@
         <w:ind w:left="2880" w:hanging="360"/>
       </w:pPr>
       <w:rPr>
-        <w:rFonts w:ascii="Symbol" w:hAnsi="Symbol" w:hint="default"/>
+        <w:rFonts w:hint="default" w:ascii="Symbol" w:hAnsi="Symbol"/>
       </w:rPr>
     </w:lvl>
     <w:lvl w:ilvl="4" w:tplc="04090003" w:tentative="1">
@@ -1328,7 +1391,7 @@
         <w:ind w:left="3600" w:hanging="360"/>
       </w:pPr>
       <w:rPr>
-        <w:rFonts w:ascii="Courier New" w:hAnsi="Courier New" w:cs="Courier New" w:hint="default"/>
+        <w:rFonts w:hint="default" w:ascii="Courier New" w:hAnsi="Courier New" w:cs="Courier New"/>
       </w:rPr>
     </w:lvl>
     <w:lvl w:ilvl="5" w:tplc="04090005" w:tentative="1">
@@ -1340,7 +1403,7 @@
         <w:ind w:left="4320" w:hanging="360"/>
       </w:pPr>
       <w:rPr>
-        <w:rFonts w:ascii="Wingdings" w:hAnsi="Wingdings" w:hint="default"/>
+        <w:rFonts w:hint="default" w:ascii="Wingdings" w:hAnsi="Wingdings"/>
       </w:rPr>
     </w:lvl>
     <w:lvl w:ilvl="6" w:tplc="04090001" w:tentative="1">
@@ -1352,7 +1415,7 @@
         <w:ind w:left="5040" w:hanging="360"/>
       </w:pPr>
       <w:rPr>
-        <w:rFonts w:ascii="Symbol" w:hAnsi="Symbol" w:hint="default"/>
+        <w:rFonts w:hint="default" w:ascii="Symbol" w:hAnsi="Symbol"/>
       </w:rPr>
     </w:lvl>
     <w:lvl w:ilvl="7" w:tplc="04090003" w:tentative="1">
@@ -1364,7 +1427,7 @@
         <w:ind w:left="5760" w:hanging="360"/>
       </w:pPr>
       <w:rPr>
-        <w:rFonts w:ascii="Courier New" w:hAnsi="Courier New" w:cs="Courier New" w:hint="default"/>
+        <w:rFonts w:hint="default" w:ascii="Courier New" w:hAnsi="Courier New" w:cs="Courier New"/>
       </w:rPr>
     </w:lvl>
     <w:lvl w:ilvl="8" w:tplc="04090005" w:tentative="1">
@@ -1376,7 +1439,7 @@
         <w:ind w:left="6480" w:hanging="360"/>
       </w:pPr>
       <w:rPr>
-        <w:rFonts w:ascii="Wingdings" w:hAnsi="Wingdings" w:hint="default"/>
+        <w:rFonts w:hint="default" w:ascii="Wingdings" w:hAnsi="Wingdings"/>
       </w:rPr>
     </w:lvl>
   </w:abstractNum>
@@ -1480,7 +1543,7 @@
   <w:docDefaults>
     <w:rPrDefault>
       <w:rPr>
-        <w:rFonts w:asciiTheme="minorHAnsi" w:eastAsiaTheme="minorHAnsi" w:hAnsiTheme="minorHAnsi" w:cstheme="minorBidi"/>
+        <w:rFonts w:asciiTheme="minorHAnsi" w:hAnsiTheme="minorHAnsi" w:eastAsiaTheme="minorHAnsi" w:cstheme="minorBidi"/>
         <w:kern w:val="2"/>
         <w:sz w:val="24"/>
         <w:szCs w:val="24"/>
@@ -1497,14 +1560,14 @@
   <w:latentStyles w:defLockedState="0" w:defUIPriority="99" w:defSemiHidden="0" w:defUnhideWhenUsed="0" w:defQFormat="0" w:count="376">
     <w:lsdException w:name="Normal" w:uiPriority="0" w:qFormat="1"/>
     <w:lsdException w:name="heading 1" w:uiPriority="9" w:qFormat="1"/>
-    <w:lsdException w:name="heading 2" w:semiHidden="1" w:uiPriority="9" w:unhideWhenUsed="1" w:qFormat="1"/>
-    <w:lsdException w:name="heading 3" w:semiHidden="1" w:uiPriority="9" w:unhideWhenUsed="1" w:qFormat="1"/>
-    <w:lsdException w:name="heading 4" w:semiHidden="1" w:uiPriority="9" w:unhideWhenUsed="1" w:qFormat="1"/>
-    <w:lsdException w:name="heading 5" w:semiHidden="1" w:uiPriority="9" w:unhideWhenUsed="1" w:qFormat="1"/>
-    <w:lsdException w:name="heading 6" w:semiHidden="1" w:uiPriority="9" w:unhideWhenUsed="1" w:qFormat="1"/>
-    <w:lsdException w:name="heading 7" w:semiHidden="1" w:uiPriority="9" w:unhideWhenUsed="1" w:qFormat="1"/>
-    <w:lsdException w:name="heading 8" w:semiHidden="1" w:uiPriority="9" w:unhideWhenUsed="1" w:qFormat="1"/>
-    <w:lsdException w:name="heading 9" w:semiHidden="1" w:uiPriority="9" w:unhideWhenUsed="1" w:qFormat="1"/>
+    <w:lsdException w:name="heading 2" w:uiPriority="9" w:semiHidden="1" w:unhideWhenUsed="1" w:qFormat="1"/>
+    <w:lsdException w:name="heading 3" w:uiPriority="9" w:semiHidden="1" w:unhideWhenUsed="1" w:qFormat="1"/>
+    <w:lsdException w:name="heading 4" w:uiPriority="9" w:semiHidden="1" w:unhideWhenUsed="1" w:qFormat="1"/>
+    <w:lsdException w:name="heading 5" w:uiPriority="9" w:semiHidden="1" w:unhideWhenUsed="1" w:qFormat="1"/>
+    <w:lsdException w:name="heading 6" w:uiPriority="9" w:semiHidden="1" w:unhideWhenUsed="1" w:qFormat="1"/>
+    <w:lsdException w:name="heading 7" w:uiPriority="9" w:semiHidden="1" w:unhideWhenUsed="1" w:qFormat="1"/>
+    <w:lsdException w:name="heading 8" w:uiPriority="9" w:semiHidden="1" w:unhideWhenUsed="1" w:qFormat="1"/>
+    <w:lsdException w:name="heading 9" w:uiPriority="9" w:semiHidden="1" w:unhideWhenUsed="1" w:qFormat="1"/>
     <w:lsdException w:name="index 1" w:semiHidden="1" w:unhideWhenUsed="1"/>
     <w:lsdException w:name="index 2" w:semiHidden="1" w:unhideWhenUsed="1"/>
     <w:lsdException w:name="index 3" w:semiHidden="1" w:unhideWhenUsed="1"/>
@@ -1514,22 +1577,22 @@
     <w:lsdException w:name="index 7" w:semiHidden="1" w:unhideWhenUsed="1"/>
     <w:lsdException w:name="index 8" w:semiHidden="1" w:unhideWhenUsed="1"/>
     <w:lsdException w:name="index 9" w:semiHidden="1" w:unhideWhenUsed="1"/>
-    <w:lsdException w:name="toc 1" w:semiHidden="1" w:uiPriority="39" w:unhideWhenUsed="1"/>
-    <w:lsdException w:name="toc 2" w:semiHidden="1" w:uiPriority="39" w:unhideWhenUsed="1"/>
-    <w:lsdException w:name="toc 3" w:semiHidden="1" w:uiPriority="39" w:unhideWhenUsed="1"/>
-    <w:lsdException w:name="toc 4" w:semiHidden="1" w:uiPriority="39" w:unhideWhenUsed="1"/>
-    <w:lsdException w:name="toc 5" w:semiHidden="1" w:uiPriority="39" w:unhideWhenUsed="1"/>
-    <w:lsdException w:name="toc 6" w:semiHidden="1" w:uiPriority="39" w:unhideWhenUsed="1"/>
-    <w:lsdException w:name="toc 7" w:semiHidden="1" w:uiPriority="39" w:unhideWhenUsed="1"/>
-    <w:lsdException w:name="toc 8" w:semiHidden="1" w:uiPriority="39" w:unhideWhenUsed="1"/>
-    <w:lsdException w:name="toc 9" w:semiHidden="1" w:uiPriority="39" w:unhideWhenUsed="1"/>
+    <w:lsdException w:name="toc 1" w:uiPriority="39" w:semiHidden="1" w:unhideWhenUsed="1"/>
+    <w:lsdException w:name="toc 2" w:uiPriority="39" w:semiHidden="1" w:unhideWhenUsed="1"/>
+    <w:lsdException w:name="toc 3" w:uiPriority="39" w:semiHidden="1" w:unhideWhenUsed="1"/>
+    <w:lsdException w:name="toc 4" w:uiPriority="39" w:semiHidden="1" w:unhideWhenUsed="1"/>
+    <w:lsdException w:name="toc 5" w:uiPriority="39" w:semiHidden="1" w:unhideWhenUsed="1"/>
+    <w:lsdException w:name="toc 6" w:uiPriority="39" w:semiHidden="1" w:unhideWhenUsed="1"/>
+    <w:lsdException w:name="toc 7" w:uiPriority="39" w:semiHidden="1" w:unhideWhenUsed="1"/>
+    <w:lsdException w:name="toc 8" w:uiPriority="39" w:semiHidden="1" w:unhideWhenUsed="1"/>
+    <w:lsdException w:name="toc 9" w:uiPriority="39" w:semiHidden="1" w:unhideWhenUsed="1"/>
     <w:lsdException w:name="Normal Indent" w:semiHidden="1" w:unhideWhenUsed="1"/>
     <w:lsdException w:name="footnote text" w:semiHidden="1" w:unhideWhenUsed="1"/>
     <w:lsdException w:name="annotation text" w:semiHidden="1" w:unhideWhenUsed="1"/>
     <w:lsdException w:name="header" w:semiHidden="1" w:unhideWhenUsed="1"/>
     <w:lsdException w:name="footer" w:semiHidden="1" w:unhideWhenUsed="1"/>
     <w:lsdException w:name="index heading" w:semiHidden="1" w:unhideWhenUsed="1"/>
-    <w:lsdException w:name="caption" w:semiHidden="1" w:uiPriority="35" w:unhideWhenUsed="1" w:qFormat="1"/>
+    <w:lsdException w:name="caption" w:uiPriority="35" w:semiHidden="1" w:unhideWhenUsed="1" w:qFormat="1"/>
     <w:lsdException w:name="table of figures" w:semiHidden="1" w:unhideWhenUsed="1"/>
     <w:lsdException w:name="envelope address" w:semiHidden="1" w:unhideWhenUsed="1"/>
     <w:lsdException w:name="envelope return" w:semiHidden="1" w:unhideWhenUsed="1"/>
@@ -1560,7 +1623,7 @@
     <w:lsdException w:name="Title" w:uiPriority="10" w:qFormat="1"/>
     <w:lsdException w:name="Closing" w:semiHidden="1" w:unhideWhenUsed="1"/>
     <w:lsdException w:name="Signature" w:semiHidden="1" w:unhideWhenUsed="1"/>
-    <w:lsdException w:name="Default Paragraph Font" w:semiHidden="1" w:uiPriority="1" w:unhideWhenUsed="1"/>
+    <w:lsdException w:name="Default Paragraph Font" w:uiPriority="1" w:semiHidden="1" w:unhideWhenUsed="1"/>
     <w:lsdException w:name="Body Text" w:semiHidden="1" w:unhideWhenUsed="1"/>
     <w:lsdException w:name="Body Text Indent" w:semiHidden="1" w:unhideWhenUsed="1"/>
     <w:lsdException w:name="List Continue" w:semiHidden="1" w:unhideWhenUsed="1"/>
@@ -1760,8 +1823,8 @@
     <w:lsdException w:name="Subtle Reference" w:uiPriority="31" w:qFormat="1"/>
     <w:lsdException w:name="Intense Reference" w:uiPriority="32" w:qFormat="1"/>
     <w:lsdException w:name="Book Title" w:uiPriority="33" w:qFormat="1"/>
-    <w:lsdException w:name="Bibliography" w:semiHidden="1" w:uiPriority="37" w:unhideWhenUsed="1"/>
-    <w:lsdException w:name="TOC Heading" w:semiHidden="1" w:uiPriority="39" w:unhideWhenUsed="1" w:qFormat="1"/>
+    <w:lsdException w:name="Bibliography" w:uiPriority="37" w:semiHidden="1" w:unhideWhenUsed="1"/>
+    <w:lsdException w:name="TOC Heading" w:uiPriority="39" w:semiHidden="1" w:unhideWhenUsed="1" w:qFormat="1"/>
     <w:lsdException w:name="Plain Table 1" w:uiPriority="41"/>
     <w:lsdException w:name="Plain Table 2" w:uiPriority="42"/>
     <w:lsdException w:name="Plain Table 3" w:uiPriority="43"/>
@@ -1872,7 +1935,7 @@
     <w:lsdException w:name="Unresolved Mention" w:semiHidden="1" w:unhideWhenUsed="1"/>
     <w:lsdException w:name="Smart Link" w:semiHidden="1" w:unhideWhenUsed="1"/>
   </w:latentStyles>
-  <w:style w:type="paragraph" w:default="1" w:styleId="Normal">
+  <w:style w:type="paragraph" w:styleId="Normal" w:default="1">
     <w:name w:val="Normal"/>
     <w:qFormat/>
   </w:style>
@@ -1891,7 +1954,7 @@
       <w:outlineLvl w:val="0"/>
     </w:pPr>
     <w:rPr>
-      <w:rFonts w:asciiTheme="majorHAnsi" w:eastAsiaTheme="majorEastAsia" w:hAnsiTheme="majorHAnsi" w:cstheme="majorBidi"/>
+      <w:rFonts w:asciiTheme="majorHAnsi" w:hAnsiTheme="majorHAnsi" w:eastAsiaTheme="majorEastAsia" w:cstheme="majorBidi"/>
       <w:color w:val="0F4761" w:themeColor="accent1" w:themeShade="BF"/>
       <w:sz w:val="40"/>
       <w:szCs w:val="40"/>
@@ -1914,7 +1977,7 @@
       <w:outlineLvl w:val="1"/>
     </w:pPr>
     <w:rPr>
-      <w:rFonts w:asciiTheme="majorHAnsi" w:eastAsiaTheme="majorEastAsia" w:hAnsiTheme="majorHAnsi" w:cstheme="majorBidi"/>
+      <w:rFonts w:asciiTheme="majorHAnsi" w:hAnsiTheme="majorHAnsi" w:eastAsiaTheme="majorEastAsia" w:cstheme="majorBidi"/>
       <w:color w:val="0F4761" w:themeColor="accent1" w:themeShade="BF"/>
       <w:sz w:val="32"/>
       <w:szCs w:val="32"/>
@@ -2075,13 +2138,13 @@
       <w:color w:val="272727" w:themeColor="text1" w:themeTint="D8"/>
     </w:rPr>
   </w:style>
-  <w:style w:type="character" w:default="1" w:styleId="DefaultParagraphFont">
+  <w:style w:type="character" w:styleId="DefaultParagraphFont" w:default="1">
     <w:name w:val="Default Paragraph Font"/>
     <w:uiPriority w:val="1"/>
     <w:semiHidden/>
     <w:unhideWhenUsed/>
   </w:style>
-  <w:style w:type="table" w:default="1" w:styleId="TableNormal">
+  <w:style w:type="table" w:styleId="TableNormal" w:default="1">
     <w:name w:val="Normal Table"/>
     <w:uiPriority w:val="99"/>
     <w:semiHidden/>
@@ -2096,26 +2159,26 @@
       </w:tblCellMar>
     </w:tblPr>
   </w:style>
-  <w:style w:type="numbering" w:default="1" w:styleId="NoList">
+  <w:style w:type="numbering" w:styleId="NoList" w:default="1">
     <w:name w:val="No List"/>
     <w:uiPriority w:val="99"/>
     <w:semiHidden/>
     <w:unhideWhenUsed/>
   </w:style>
-  <w:style w:type="character" w:customStyle="1" w:styleId="Heading1Char">
+  <w:style w:type="character" w:styleId="Heading1Char" w:customStyle="1">
     <w:name w:val="Heading 1 Char"/>
     <w:basedOn w:val="DefaultParagraphFont"/>
     <w:link w:val="Heading1"/>
     <w:uiPriority w:val="9"/>
     <w:rsid w:val="00EB4686"/>
     <w:rPr>
-      <w:rFonts w:asciiTheme="majorHAnsi" w:eastAsiaTheme="majorEastAsia" w:hAnsiTheme="majorHAnsi" w:cstheme="majorBidi"/>
+      <w:rFonts w:asciiTheme="majorHAnsi" w:hAnsiTheme="majorHAnsi" w:eastAsiaTheme="majorEastAsia" w:cstheme="majorBidi"/>
       <w:color w:val="0F4761" w:themeColor="accent1" w:themeShade="BF"/>
       <w:sz w:val="40"/>
       <w:szCs w:val="40"/>
     </w:rPr>
   </w:style>
-  <w:style w:type="character" w:customStyle="1" w:styleId="Heading2Char">
+  <w:style w:type="character" w:styleId="Heading2Char" w:customStyle="1">
     <w:name w:val="Heading 2 Char"/>
     <w:basedOn w:val="DefaultParagraphFont"/>
     <w:link w:val="Heading2"/>
@@ -2123,13 +2186,13 @@
     <w:semiHidden/>
     <w:rsid w:val="00EB4686"/>
     <w:rPr>
-      <w:rFonts w:asciiTheme="majorHAnsi" w:eastAsiaTheme="majorEastAsia" w:hAnsiTheme="majorHAnsi" w:cstheme="majorBidi"/>
+      <w:rFonts w:asciiTheme="majorHAnsi" w:hAnsiTheme="majorHAnsi" w:eastAsiaTheme="majorEastAsia" w:cstheme="majorBidi"/>
       <w:color w:val="0F4761" w:themeColor="accent1" w:themeShade="BF"/>
       <w:sz w:val="32"/>
       <w:szCs w:val="32"/>
     </w:rPr>
   </w:style>
-  <w:style w:type="character" w:customStyle="1" w:styleId="Heading3Char">
+  <w:style w:type="character" w:styleId="Heading3Char" w:customStyle="1">
     <w:name w:val="Heading 3 Char"/>
     <w:basedOn w:val="DefaultParagraphFont"/>
     <w:link w:val="Heading3"/>
@@ -2143,7 +2206,7 @@
       <w:szCs w:val="28"/>
     </w:rPr>
   </w:style>
-  <w:style w:type="character" w:customStyle="1" w:styleId="Heading4Char">
+  <w:style w:type="character" w:styleId="Heading4Char" w:customStyle="1">
     <w:name w:val="Heading 4 Char"/>
     <w:basedOn w:val="DefaultParagraphFont"/>
     <w:link w:val="Heading4"/>
@@ -2157,7 +2220,7 @@
       <w:color w:val="0F4761" w:themeColor="accent1" w:themeShade="BF"/>
     </w:rPr>
   </w:style>
-  <w:style w:type="character" w:customStyle="1" w:styleId="Heading5Char">
+  <w:style w:type="character" w:styleId="Heading5Char" w:customStyle="1">
     <w:name w:val="Heading 5 Char"/>
     <w:basedOn w:val="DefaultParagraphFont"/>
     <w:link w:val="Heading5"/>
@@ -2169,7 +2232,7 @@
       <w:color w:val="0F4761" w:themeColor="accent1" w:themeShade="BF"/>
     </w:rPr>
   </w:style>
-  <w:style w:type="character" w:customStyle="1" w:styleId="Heading6Char">
+  <w:style w:type="character" w:styleId="Heading6Char" w:customStyle="1">
     <w:name w:val="Heading 6 Char"/>
     <w:basedOn w:val="DefaultParagraphFont"/>
     <w:link w:val="Heading6"/>
@@ -2183,7 +2246,7 @@
       <w:color w:val="595959" w:themeColor="text1" w:themeTint="A6"/>
     </w:rPr>
   </w:style>
-  <w:style w:type="character" w:customStyle="1" w:styleId="Heading7Char">
+  <w:style w:type="character" w:styleId="Heading7Char" w:customStyle="1">
     <w:name w:val="Heading 7 Char"/>
     <w:basedOn w:val="DefaultParagraphFont"/>
     <w:link w:val="Heading7"/>
@@ -2195,7 +2258,7 @@
       <w:color w:val="595959" w:themeColor="text1" w:themeTint="A6"/>
     </w:rPr>
   </w:style>
-  <w:style w:type="character" w:customStyle="1" w:styleId="Heading8Char">
+  <w:style w:type="character" w:styleId="Heading8Char" w:customStyle="1">
     <w:name w:val="Heading 8 Char"/>
     <w:basedOn w:val="DefaultParagraphFont"/>
     <w:link w:val="Heading8"/>
@@ -2209,7 +2272,7 @@
       <w:color w:val="272727" w:themeColor="text1" w:themeTint="D8"/>
     </w:rPr>
   </w:style>
-  <w:style w:type="character" w:customStyle="1" w:styleId="Heading9Char">
+  <w:style w:type="character" w:styleId="Heading9Char" w:customStyle="1">
     <w:name w:val="Heading 9 Char"/>
     <w:basedOn w:val="DefaultParagraphFont"/>
     <w:link w:val="Heading9"/>
@@ -2234,21 +2297,21 @@
       <w:contextualSpacing/>
     </w:pPr>
     <w:rPr>
-      <w:rFonts w:asciiTheme="majorHAnsi" w:eastAsiaTheme="majorEastAsia" w:hAnsiTheme="majorHAnsi" w:cstheme="majorBidi"/>
+      <w:rFonts w:asciiTheme="majorHAnsi" w:hAnsiTheme="majorHAnsi" w:eastAsiaTheme="majorEastAsia" w:cstheme="majorBidi"/>
       <w:spacing w:val="-10"/>
       <w:kern w:val="28"/>
       <w:sz w:val="56"/>
       <w:szCs w:val="56"/>
     </w:rPr>
   </w:style>
-  <w:style w:type="character" w:customStyle="1" w:styleId="TitleChar">
+  <w:style w:type="character" w:styleId="TitleChar" w:customStyle="1">
     <w:name w:val="Title Char"/>
     <w:basedOn w:val="DefaultParagraphFont"/>
     <w:link w:val="Title"/>
     <w:uiPriority w:val="10"/>
     <w:rsid w:val="00EB4686"/>
     <w:rPr>
-      <w:rFonts w:asciiTheme="majorHAnsi" w:eastAsiaTheme="majorEastAsia" w:hAnsiTheme="majorHAnsi" w:cstheme="majorBidi"/>
+      <w:rFonts w:asciiTheme="majorHAnsi" w:hAnsiTheme="majorHAnsi" w:eastAsiaTheme="majorEastAsia" w:cstheme="majorBidi"/>
       <w:spacing w:val="-10"/>
       <w:kern w:val="28"/>
       <w:sz w:val="56"/>
@@ -2276,7 +2339,7 @@
       <w:szCs w:val="28"/>
     </w:rPr>
   </w:style>
-  <w:style w:type="character" w:customStyle="1" w:styleId="SubtitleChar">
+  <w:style w:type="character" w:styleId="SubtitleChar" w:customStyle="1">
     <w:name w:val="Subtitle Char"/>
     <w:basedOn w:val="DefaultParagraphFont"/>
     <w:link w:val="Subtitle"/>
@@ -2308,7 +2371,7 @@
       <w:color w:val="404040" w:themeColor="text1" w:themeTint="BF"/>
     </w:rPr>
   </w:style>
-  <w:style w:type="character" w:customStyle="1" w:styleId="QuoteChar">
+  <w:style w:type="character" w:styleId="QuoteChar" w:customStyle="1">
     <w:name w:val="Quote Char"/>
     <w:basedOn w:val="DefaultParagraphFont"/>
     <w:link w:val="Quote"/>
@@ -2353,8 +2416,8 @@
     <w:rsid w:val="00EB4686"/>
     <w:pPr>
       <w:pBdr>
-        <w:top w:val="single" w:sz="4" w:space="10" w:color="0F4761" w:themeColor="accent1" w:themeShade="BF"/>
-        <w:bottom w:val="single" w:sz="4" w:space="10" w:color="0F4761" w:themeColor="accent1" w:themeShade="BF"/>
+        <w:top w:val="single" w:color="0F4761" w:themeColor="accent1" w:themeShade="BF" w:sz="4" w:space="10"/>
+        <w:bottom w:val="single" w:color="0F4761" w:themeColor="accent1" w:themeShade="BF" w:sz="4" w:space="10"/>
       </w:pBdr>
       <w:spacing w:before="360" w:after="360"/>
       <w:ind w:left="864" w:right="864"/>
@@ -2366,7 +2429,7 @@
       <w:color w:val="0F4761" w:themeColor="accent1" w:themeShade="BF"/>
     </w:rPr>
   </w:style>
-  <w:style w:type="character" w:customStyle="1" w:styleId="IntenseQuoteChar">
+  <w:style w:type="character" w:styleId="IntenseQuoteChar" w:customStyle="1">
     <w:name w:val="Intense Quote Char"/>
     <w:basedOn w:val="DefaultParagraphFont"/>
     <w:link w:val="IntenseQuote"/>
@@ -2406,7 +2469,7 @@
 </file>
 
 <file path=word/theme/theme1.xml><?xml version="1.0" encoding="utf-8"?>
-<a:theme xmlns:a="http://schemas.openxmlformats.org/drawingml/2006/main" name="Office Theme">
+<a:theme xmlns:a="http://schemas.openxmlformats.org/drawingml/2006/main" xmlns:thm15="http://schemas.microsoft.com/office/thememl/2012/main" name="Office Theme">
   <a:themeElements>
     <a:clrScheme name="Office">
       <a:dk1>

</xml_diff>